<commit_message>
Regenerate technical documentation DOCX and PDF
</commit_message>
<xml_diff>
--- a/docs/SmartPot_Technical_Documentation.docx
+++ b/docs/SmartPot_Technical_Documentation.docx
@@ -450,6 +450,7 @@
     </w:p>
     <w:p>
       <w:pPr>
+        <w:keepNext/>
         <w:spacing w:before="60" w:after="0" w:line="240" w:lineRule="auto"/>
         <w:rPr>
           <w:sz w:val="8"/>
@@ -2243,6 +2244,7 @@
     </w:p>
     <w:p>
       <w:pPr>
+        <w:keepNext/>
         <w:spacing w:before="60" w:after="0" w:line="240" w:lineRule="auto"/>
         <w:rPr>
           <w:sz w:val="8"/>
@@ -4062,6 +4064,7 @@
     </w:p>
     <w:p>
       <w:pPr>
+        <w:keepNext/>
         <w:spacing w:before="60" w:after="0" w:line="240" w:lineRule="auto"/>
         <w:rPr>
           <w:sz w:val="8"/>
@@ -5369,6 +5372,7 @@
     </w:p>
     <w:p>
       <w:pPr>
+        <w:keepNext/>
         <w:spacing w:before="60" w:after="0" w:line="240" w:lineRule="auto"/>
         <w:rPr>
           <w:sz w:val="8"/>
@@ -6025,6 +6029,7 @@
     </w:p>
     <w:p>
       <w:pPr>
+        <w:keepNext/>
         <w:spacing w:before="60" w:after="0" w:line="240" w:lineRule="auto"/>
         <w:rPr>
           <w:sz w:val="8"/>
@@ -6923,6 +6928,7 @@
     </w:p>
     <w:p>
       <w:pPr>
+        <w:keepNext/>
         <w:spacing w:before="60" w:after="0" w:line="240" w:lineRule="auto"/>
         <w:rPr>
           <w:sz w:val="8"/>
@@ -7572,6 +7578,7 @@
     </w:p>
     <w:p>
       <w:pPr>
+        <w:keepNext/>
         <w:spacing w:before="60" w:after="0" w:line="240" w:lineRule="auto"/>
         <w:rPr>
           <w:sz w:val="8"/>
@@ -8227,6 +8234,7 @@
     </w:p>
     <w:p>
       <w:pPr>
+        <w:keepNext/>
         <w:spacing w:before="60" w:after="0" w:line="240" w:lineRule="auto"/>
         <w:rPr>
           <w:sz w:val="8"/>
@@ -8783,6 +8791,7 @@
     </w:p>
     <w:p>
       <w:pPr>
+        <w:keepNext/>
         <w:spacing w:before="60" w:after="0" w:line="240" w:lineRule="auto"/>
         <w:rPr>
           <w:sz w:val="8"/>
@@ -11137,6 +11146,7 @@
     </w:p>
     <w:p>
       <w:pPr>
+        <w:keepNext/>
         <w:spacing w:before="60" w:after="0" w:line="240" w:lineRule="auto"/>
         <w:rPr>
           <w:sz w:val="8"/>
@@ -11959,6 +11969,7 @@
     </w:p>
     <w:p>
       <w:pPr>
+        <w:keepNext/>
         <w:spacing w:before="60" w:after="0" w:line="240" w:lineRule="auto"/>
         <w:rPr>
           <w:sz w:val="8"/>
@@ -12855,6 +12866,7 @@
     </w:p>
     <w:p>
       <w:pPr>
+        <w:keepNext/>
         <w:spacing w:before="60" w:after="0" w:line="240" w:lineRule="auto"/>
         <w:rPr>
           <w:sz w:val="8"/>
@@ -13381,6 +13393,7 @@
     </w:p>
     <w:p>
       <w:pPr>
+        <w:keepNext/>
         <w:spacing w:before="60" w:after="0" w:line="240" w:lineRule="auto"/>
         <w:rPr>
           <w:sz w:val="8"/>
@@ -15250,6 +15263,7 @@
     </w:p>
     <w:p>
       <w:pPr>
+        <w:keepNext/>
         <w:spacing w:before="60" w:after="0" w:line="240" w:lineRule="auto"/>
         <w:rPr>
           <w:sz w:val="8"/>
@@ -15843,6 +15857,7 @@
     </w:p>
     <w:p>
       <w:pPr>
+        <w:keepNext/>
         <w:spacing w:before="60" w:after="0" w:line="240" w:lineRule="auto"/>
         <w:rPr>
           <w:sz w:val="8"/>
@@ -16818,6 +16833,7 @@
     </w:p>
     <w:p>
       <w:pPr>
+        <w:keepNext/>
         <w:spacing w:before="60" w:after="0" w:line="240" w:lineRule="auto"/>
         <w:rPr>
           <w:sz w:val="8"/>
@@ -17353,6 +17369,7 @@
     </w:p>
     <w:p>
       <w:pPr>
+        <w:keepNext/>
         <w:spacing w:before="60" w:after="0" w:line="240" w:lineRule="auto"/>
         <w:rPr>
           <w:sz w:val="8"/>
@@ -17852,6 +17869,7 @@
     </w:p>
     <w:p>
       <w:pPr>
+        <w:keepNext/>
         <w:spacing w:before="60" w:after="0" w:line="240" w:lineRule="auto"/>
         <w:rPr>
           <w:sz w:val="8"/>
@@ -18605,6 +18623,7 @@
     </w:p>
     <w:p>
       <w:pPr>
+        <w:keepNext/>
         <w:spacing w:before="60" w:after="0" w:line="240" w:lineRule="auto"/>
         <w:rPr>
           <w:sz w:val="8"/>
@@ -19815,6 +19834,105 @@
     </w:p>
     <w:p>
       <w:pPr>
+        <w:spacing w:before="0" w:after="140" w:line="288" w:lineRule="auto"/>
+      </w:pPr>
+      <w:r>
+        <w:rPr>
+          <w:color w:val="17261F"/>
+          <w:sz w:val="20"/>
+          <w:szCs w:val="20"/>
+        </w:rPr>
+        <w:t xml:space="preserve">Los validadores viven en un solo archivo de SmartPot-DB (</w:t>
+      </w:r>
+      <w:r>
+        <w:rPr>
+          <w:rFonts w:ascii="JetBrains Mono" w:hAnsi="JetBrains Mono" w:eastAsia="JetBrains Mono" w:cs="JetBrains Mono"/>
+          <w:color w:val="0A5A3C"/>
+          <w:sz w:val="18"/>
+          <w:szCs w:val="18"/>
+        </w:rPr>
+        <w:t xml:space="preserve">schemas/collections.js</w:t>
+      </w:r>
+      <w:r>
+        <w:rPr>
+          <w:color w:val="17261F"/>
+          <w:sz w:val="20"/>
+          <w:szCs w:val="20"/>
+        </w:rPr>
+        <w:t xml:space="preserve">). Una base nueva los recibe al crearse; una existente, con la </w:t>
+      </w:r>
+      <w:r>
+        <w:rPr>
+          <w:b/>
+          <w:bCs/>
+          <w:color w:val="17261F"/>
+          <w:sz w:val="20"/>
+          <w:szCs w:val="20"/>
+        </w:rPr>
+        <w:t xml:space="preserve">migración</w:t>
+      </w:r>
+      <w:r>
+        <w:rPr>
+          <w:color w:val="17261F"/>
+          <w:sz w:val="20"/>
+          <w:szCs w:val="20"/>
+        </w:rPr>
+        <w:t xml:space="preserve"> (</w:t>
+      </w:r>
+      <w:r>
+        <w:rPr>
+          <w:rFonts w:ascii="JetBrains Mono" w:hAnsi="JetBrains Mono" w:eastAsia="JetBrains Mono" w:cs="JetBrains Mono"/>
+          <w:color w:val="0A5A3C"/>
+          <w:sz w:val="18"/>
+          <w:szCs w:val="18"/>
+        </w:rPr>
+        <w:t xml:space="preserve">/opt/smartpot/migrate.js</w:t>
+      </w:r>
+      <w:r>
+        <w:rPr>
+          <w:color w:val="17261F"/>
+          <w:sz w:val="20"/>
+          <w:szCs w:val="20"/>
+        </w:rPr>
+        <w:t xml:space="preserve">), que el despliegue ejecuta después de actualizar los contenedores. Es idempotente: crea las colecciones que falten y pone o actualiza cada validador sin tocar los documentos. Si una colección tiene documentos antiguos que no cumplen el esquema, su validación queda en </w:t>
+      </w:r>
+      <w:r>
+        <w:rPr>
+          <w:rFonts w:ascii="JetBrains Mono" w:hAnsi="JetBrains Mono" w:eastAsia="JetBrains Mono" w:cs="JetBrains Mono"/>
+          <w:color w:val="0A5A3C"/>
+          <w:sz w:val="18"/>
+          <w:szCs w:val="18"/>
+        </w:rPr>
+        <w:t xml:space="preserve">moderate</w:t>
+      </w:r>
+      <w:r>
+        <w:rPr>
+          <w:color w:val="17261F"/>
+          <w:sz w:val="20"/>
+          <w:szCs w:val="20"/>
+        </w:rPr>
+        <w:t xml:space="preserve"> para que se puedan seguir actualizando; si no, en </w:t>
+      </w:r>
+      <w:r>
+        <w:rPr>
+          <w:rFonts w:ascii="JetBrains Mono" w:hAnsi="JetBrains Mono" w:eastAsia="JetBrains Mono" w:cs="JetBrains Mono"/>
+          <w:color w:val="0A5A3C"/>
+          <w:sz w:val="18"/>
+          <w:szCs w:val="18"/>
+        </w:rPr>
+        <w:t xml:space="preserve">strict</w:t>
+      </w:r>
+      <w:r>
+        <w:rPr>
+          <w:color w:val="17261F"/>
+          <w:sz w:val="20"/>
+          <w:szCs w:val="20"/>
+        </w:rPr>
+        <w:t xml:space="preserve">.</w:t>
+      </w:r>
+    </w:p>
+    <w:p>
+      <w:pPr>
         <w:keepNext/>
         <w:spacing w:before="360" w:after="40" w:line="288" w:lineRule="auto"/>
       </w:pPr>
@@ -19879,6 +19997,7 @@
     </w:p>
     <w:p>
       <w:pPr>
+        <w:keepNext/>
         <w:spacing w:before="60" w:after="0" w:line="240" w:lineRule="auto"/>
         <w:rPr>
           <w:sz w:val="8"/>
@@ -20825,6 +20944,7 @@
     </w:p>
     <w:p>
       <w:pPr>
+        <w:keepNext/>
         <w:spacing w:before="60" w:after="0" w:line="240" w:lineRule="auto"/>
         <w:rPr>
           <w:sz w:val="8"/>
@@ -22212,6 +22332,7 @@
     </w:p>
     <w:p>
       <w:pPr>
+        <w:keepNext/>
         <w:spacing w:before="60" w:after="0" w:line="240" w:lineRule="auto"/>
         <w:rPr>
           <w:sz w:val="8"/>
@@ -23291,6 +23412,7 @@
     </w:p>
     <w:p>
       <w:pPr>
+        <w:keepNext/>
         <w:spacing w:before="60" w:after="0" w:line="240" w:lineRule="auto"/>
         <w:rPr>
           <w:sz w:val="8"/>
@@ -23881,6 +24003,7 @@
     </w:p>
     <w:p>
       <w:pPr>
+        <w:keepNext/>
         <w:spacing w:before="60" w:after="0" w:line="240" w:lineRule="auto"/>
         <w:rPr>
           <w:sz w:val="8"/>
@@ -24985,6 +25108,7 @@
     </w:p>
     <w:p>
       <w:pPr>
+        <w:keepNext/>
         <w:spacing w:before="60" w:after="0" w:line="240" w:lineRule="auto"/>
         <w:rPr>
           <w:sz w:val="8"/>
@@ -25646,7 +25770,7 @@
       <w:r>
         <w:drawing>
           <wp:inline distT="0" distB="0" distL="0" distR="0">
-            <wp:extent cx="5943600" cy="5174912"/>
+            <wp:extent cx="5943600" cy="5280149"/>
             <wp:docPr id="158" name="SmartPot_06_Deployment"/>
             <wp:cNvGraphicFramePr>
               <a:graphicFrameLocks noChangeAspect="1"/>
@@ -25667,7 +25791,7 @@
                   <pic:spPr>
                     <a:xfrm>
                       <a:off x="0" y="0"/>
-                      <a:ext cx="5943600" cy="5174912"/>
+                      <a:ext cx="5943600" cy="5280149"/>
                     </a:xfrm>
                     <a:prstGeom prst="rect">
                       <a:avLst/>
@@ -25869,7 +25993,7 @@
           <w:sz w:val="20"/>
           <w:szCs w:val="20"/>
         </w:rPr>
-        <w:t xml:space="preserve">, descarga las imágenes desde GHCR, actualiza los contenedores y verifica </w:t>
+        <w:t xml:space="preserve">, descarga las imágenes desde GHCR, actualiza los contenedores, aplica los esquemas de la base con la migración de SmartPot-DB y verifica </w:t>
       </w:r>
       <w:r>
         <w:rPr>
@@ -25908,6 +26032,7 @@
     </w:p>
     <w:p>
       <w:pPr>
+        <w:keepNext/>
         <w:spacing w:before="60" w:after="0" w:line="240" w:lineRule="auto"/>
         <w:rPr>
           <w:sz w:val="8"/>
@@ -26698,6 +26823,7 @@
     </w:p>
     <w:p>
       <w:pPr>
+        <w:keepNext/>
         <w:spacing w:before="60" w:after="0" w:line="240" w:lineRule="auto"/>
         <w:rPr>
           <w:sz w:val="8"/>
@@ -27320,6 +27446,7 @@
     </w:p>
     <w:p>
       <w:pPr>
+        <w:keepNext/>
         <w:spacing w:before="60" w:after="0" w:line="240" w:lineRule="auto"/>
         <w:rPr>
           <w:sz w:val="8"/>
@@ -28167,6 +28294,7 @@
     </w:p>
     <w:p>
       <w:pPr>
+        <w:keepNext/>
         <w:spacing w:before="60" w:after="0" w:line="240" w:lineRule="auto"/>
         <w:rPr>
           <w:sz w:val="8"/>
@@ -28722,7 +28850,7 @@
                 <w:sz w:val="17"/>
                 <w:szCs w:val="17"/>
               </w:rPr>
-              <w:t xml:space="preserve">Renovar el certificado del broker</w:t>
+              <w:t xml:space="preserve">Migrar la base</w:t>
             </w:r>
           </w:p>
         </w:tc>
@@ -28748,7 +28876,7 @@
                 <w:sz w:val="17"/>
                 <w:szCs w:val="17"/>
               </w:rPr>
-              <w:t xml:space="preserve">Antes de 825 días: </w:t>
+              <w:t xml:space="preserve">La ejecuta cada despliegue; a mano: </w:t>
             </w:r>
             <w:r>
               <w:rPr>
@@ -28757,15 +28885,15 @@
                 <w:sz w:val="15"/>
                 <w:szCs w:val="15"/>
               </w:rPr>
-              <w:t xml:space="preserve">generate-certs.sh</w:t>
-            </w:r>
-            <w:r>
-              <w:rPr>
-                <w:color w:val="17261F"/>
-                <w:sz w:val="17"/>
-                <w:szCs w:val="17"/>
-              </w:rPr>
-              <w:t xml:space="preserve"> con la CA existente y actualizar </w:t>
+              <w:t xml:space="preserve">docker exec smartpot-db mongosh --quiet /opt/smartpot/migrate.js</w:t>
+            </w:r>
+            <w:r>
+              <w:rPr>
+                <w:color w:val="17261F"/>
+                <w:sz w:val="17"/>
+                <w:szCs w:val="17"/>
+              </w:rPr>
+              <w:t xml:space="preserve"> (en la demo, </w:t>
             </w:r>
             <w:r>
               <w:rPr>
@@ -28774,24 +28902,15 @@
                 <w:sz w:val="15"/>
                 <w:szCs w:val="15"/>
               </w:rPr>
-              <w:t xml:space="preserve">MQTT_SERVER_CERT</w:t>
-            </w:r>
-            <w:r>
-              <w:rPr>
-                <w:color w:val="17261F"/>
-                <w:sz w:val="17"/>
-                <w:szCs w:val="17"/>
-              </w:rPr>
-              <w:t xml:space="preserve"> y </w:t>
-            </w:r>
-            <w:r>
-              <w:rPr>
-                <w:rFonts w:ascii="JetBrains Mono" w:hAnsi="JetBrains Mono" w:eastAsia="JetBrains Mono" w:cs="JetBrains Mono"/>
-                <w:color w:val="0A5A3C"/>
-                <w:sz w:val="15"/>
-                <w:szCs w:val="15"/>
-              </w:rPr>
-              <w:t xml:space="preserve">MQTT_SERVER_KEY</w:t>
+              <w:t xml:space="preserve">smartpot-demo-db</w:t>
+            </w:r>
+            <w:r>
+              <w:rPr>
+                <w:color w:val="17261F"/>
+                <w:sz w:val="17"/>
+                <w:szCs w:val="17"/>
+              </w:rPr>
+              <w:t xml:space="preserve">)</w:t>
             </w:r>
           </w:p>
         </w:tc>
@@ -28824,7 +28943,7 @@
                 <w:sz w:val="17"/>
                 <w:szCs w:val="17"/>
               </w:rPr>
-              <w:t xml:space="preserve">Rotar la clave de una maceta</w:t>
+              <w:t xml:space="preserve">Renovar el certificado del broker</w:t>
             </w:r>
           </w:p>
         </w:tc>
@@ -28850,7 +28969,50 @@
                 <w:sz w:val="17"/>
                 <w:szCs w:val="17"/>
               </w:rPr>
-              <w:t xml:space="preserve">Desde la PWA, pestaña Dispositivo (la maceta virtual toma la clave nueva sola)</w:t>
+              <w:t xml:space="preserve">Antes de 825 días: </w:t>
+            </w:r>
+            <w:r>
+              <w:rPr>
+                <w:rFonts w:ascii="JetBrains Mono" w:hAnsi="JetBrains Mono" w:eastAsia="JetBrains Mono" w:cs="JetBrains Mono"/>
+                <w:color w:val="0A5A3C"/>
+                <w:sz w:val="15"/>
+                <w:szCs w:val="15"/>
+              </w:rPr>
+              <w:t xml:space="preserve">generate-certs.sh</w:t>
+            </w:r>
+            <w:r>
+              <w:rPr>
+                <w:color w:val="17261F"/>
+                <w:sz w:val="17"/>
+                <w:szCs w:val="17"/>
+              </w:rPr>
+              <w:t xml:space="preserve"> con la CA existente y actualizar </w:t>
+            </w:r>
+            <w:r>
+              <w:rPr>
+                <w:rFonts w:ascii="JetBrains Mono" w:hAnsi="JetBrains Mono" w:eastAsia="JetBrains Mono" w:cs="JetBrains Mono"/>
+                <w:color w:val="0A5A3C"/>
+                <w:sz w:val="15"/>
+                <w:szCs w:val="15"/>
+              </w:rPr>
+              <w:t xml:space="preserve">MQTT_SERVER_CERT</w:t>
+            </w:r>
+            <w:r>
+              <w:rPr>
+                <w:color w:val="17261F"/>
+                <w:sz w:val="17"/>
+                <w:szCs w:val="17"/>
+              </w:rPr>
+              <w:t xml:space="preserve"> y </w:t>
+            </w:r>
+            <w:r>
+              <w:rPr>
+                <w:rFonts w:ascii="JetBrains Mono" w:hAnsi="JetBrains Mono" w:eastAsia="JetBrains Mono" w:cs="JetBrains Mono"/>
+                <w:color w:val="0A5A3C"/>
+                <w:sz w:val="15"/>
+                <w:szCs w:val="15"/>
+              </w:rPr>
+              <w:t xml:space="preserve">MQTT_SERVER_KEY</w:t>
             </w:r>
           </w:p>
         </w:tc>
@@ -28883,7 +29045,7 @@
                 <w:sz w:val="17"/>
                 <w:szCs w:val="17"/>
               </w:rPr>
-              <w:t xml:space="preserve">Aprendizaje</w:t>
+              <w:t xml:space="preserve">Rotar la clave de una maceta</w:t>
             </w:r>
           </w:p>
         </w:tc>
@@ -28909,33 +29071,7 @@
                 <w:sz w:val="17"/>
                 <w:szCs w:val="17"/>
               </w:rPr>
-              <w:t xml:space="preserve">Página Aprendizaje de la PWA; </w:t>
-            </w:r>
-            <w:r>
-              <w:rPr>
-                <w:rFonts w:ascii="JetBrains Mono" w:hAnsi="JetBrains Mono" w:eastAsia="JetBrains Mono" w:cs="JetBrains Mono"/>
-                <w:color w:val="0A5A3C"/>
-                <w:sz w:val="15"/>
-                <w:szCs w:val="15"/>
-              </w:rPr>
-              <w:t xml:space="preserve">docker logs smartpot-ai</w:t>
-            </w:r>
-            <w:r>
-              <w:rPr>
-                <w:color w:val="17261F"/>
-                <w:sz w:val="17"/>
-                <w:szCs w:val="17"/>
-              </w:rPr>
-              <w:t xml:space="preserve"> muestra cada entrenamiento. Lo aprendido vive en el volumen </w:t>
-            </w:r>
-            <w:r>
-              <w:rPr>
-                <w:rFonts w:ascii="JetBrains Mono" w:hAnsi="JetBrains Mono" w:eastAsia="JetBrains Mono" w:cs="JetBrains Mono"/>
-                <w:color w:val="0A5A3C"/>
-                <w:sz w:val="15"/>
-                <w:szCs w:val="15"/>
-              </w:rPr>
-              <w:t xml:space="preserve">ai_data</w:t>
+              <w:t xml:space="preserve">Desde la PWA, pestaña Dispositivo (la maceta virtual toma la clave nueva sola)</w:t>
             </w:r>
           </w:p>
         </w:tc>
@@ -28968,7 +29104,7 @@
                 <w:sz w:val="17"/>
                 <w:szCs w:val="17"/>
               </w:rPr>
-              <w:t xml:space="preserve">Activar Telegram</w:t>
+              <w:t xml:space="preserve">Aprendizaje</w:t>
             </w:r>
           </w:p>
         </w:tc>
@@ -28994,7 +29130,7 @@
                 <w:sz w:val="17"/>
                 <w:szCs w:val="17"/>
               </w:rPr>
-              <w:t xml:space="preserve">Crear el bot con @BotFather, agregar </w:t>
+              <w:t xml:space="preserve">Página Aprendizaje de la PWA; </w:t>
             </w:r>
             <w:r>
               <w:rPr>
@@ -29003,15 +29139,15 @@
                 <w:sz w:val="15"/>
                 <w:szCs w:val="15"/>
               </w:rPr>
-              <w:t xml:space="preserve">TELEGRAM_BOT_TOKEN</w:t>
-            </w:r>
-            <w:r>
-              <w:rPr>
-                <w:color w:val="17261F"/>
-                <w:sz w:val="17"/>
-                <w:szCs w:val="17"/>
-              </w:rPr>
-              <w:t xml:space="preserve">, </w:t>
+              <w:t xml:space="preserve">docker logs smartpot-ai</w:t>
+            </w:r>
+            <w:r>
+              <w:rPr>
+                <w:color w:val="17261F"/>
+                <w:sz w:val="17"/>
+                <w:szCs w:val="17"/>
+              </w:rPr>
+              <w:t xml:space="preserve"> muestra cada entrenamiento. Lo aprendido vive en el volumen </w:t>
             </w:r>
             <w:r>
               <w:rPr>
@@ -29020,49 +29156,7 @@
                 <w:sz w:val="15"/>
                 <w:szCs w:val="15"/>
               </w:rPr>
-              <w:t xml:space="preserve">TELEGRAM_BOT_USERNAME</w:t>
-            </w:r>
-            <w:r>
-              <w:rPr>
-                <w:color w:val="17261F"/>
-                <w:sz w:val="17"/>
-                <w:szCs w:val="17"/>
-              </w:rPr>
-              <w:t xml:space="preserve"> y </w:t>
-            </w:r>
-            <w:r>
-              <w:rPr>
-                <w:rFonts w:ascii="JetBrains Mono" w:hAnsi="JetBrains Mono" w:eastAsia="JetBrains Mono" w:cs="JetBrains Mono"/>
-                <w:color w:val="0A5A3C"/>
-                <w:sz w:val="15"/>
-                <w:szCs w:val="15"/>
-              </w:rPr>
-              <w:t xml:space="preserve">TELEGRAM_WEBHOOK_SECRET</w:t>
-            </w:r>
-            <w:r>
-              <w:rPr>
-                <w:color w:val="17261F"/>
-                <w:sz w:val="17"/>
-                <w:szCs w:val="17"/>
-              </w:rPr>
-              <w:t xml:space="preserve"> a </w:t>
-            </w:r>
-            <w:r>
-              <w:rPr>
-                <w:rFonts w:ascii="JetBrains Mono" w:hAnsi="JetBrains Mono" w:eastAsia="JetBrains Mono" w:cs="JetBrains Mono"/>
-                <w:color w:val="0A5A3C"/>
-                <w:sz w:val="15"/>
-                <w:szCs w:val="15"/>
-              </w:rPr>
-              <w:t xml:space="preserve">ENV_FILE</w:t>
-            </w:r>
-            <w:r>
-              <w:rPr>
-                <w:color w:val="17261F"/>
-                <w:sz w:val="17"/>
-                <w:szCs w:val="17"/>
-              </w:rPr>
-              <w:t xml:space="preserve"> y desplegar</w:t>
+              <w:t xml:space="preserve">ai_data</w:t>
             </w:r>
           </w:p>
         </w:tc>
@@ -29095,6 +29189,133 @@
                 <w:sz w:val="17"/>
                 <w:szCs w:val="17"/>
               </w:rPr>
+              <w:t xml:space="preserve">Activar Telegram</w:t>
+            </w:r>
+          </w:p>
+        </w:tc>
+        <w:tc>
+          <w:tcPr>
+            <w:tcW w:w="6857" w:type="dxa"/>
+            <w:shd w:val="clear" w:color="auto" w:fill="F2F7F4"/>
+            <w:tcMar>
+              <w:top w:w="70" w:type="dxa"/>
+              <w:left w:w="110" w:type="dxa"/>
+              <w:bottom w:w="70" w:type="dxa"/>
+              <w:right w:w="110" w:type="dxa"/>
+            </w:tcMar>
+            <w:vAlign w:val="center"/>
+          </w:tcPr>
+          <w:p>
+            <w:pPr>
+              <w:spacing w:before="0" w:after="0" w:line="252" w:lineRule="auto"/>
+            </w:pPr>
+            <w:r>
+              <w:rPr>
+                <w:color w:val="17261F"/>
+                <w:sz w:val="17"/>
+                <w:szCs w:val="17"/>
+              </w:rPr>
+              <w:t xml:space="preserve">Crear el bot con @BotFather, agregar </w:t>
+            </w:r>
+            <w:r>
+              <w:rPr>
+                <w:rFonts w:ascii="JetBrains Mono" w:hAnsi="JetBrains Mono" w:eastAsia="JetBrains Mono" w:cs="JetBrains Mono"/>
+                <w:color w:val="0A5A3C"/>
+                <w:sz w:val="15"/>
+                <w:szCs w:val="15"/>
+              </w:rPr>
+              <w:t xml:space="preserve">TELEGRAM_BOT_TOKEN</w:t>
+            </w:r>
+            <w:r>
+              <w:rPr>
+                <w:color w:val="17261F"/>
+                <w:sz w:val="17"/>
+                <w:szCs w:val="17"/>
+              </w:rPr>
+              <w:t xml:space="preserve">, </w:t>
+            </w:r>
+            <w:r>
+              <w:rPr>
+                <w:rFonts w:ascii="JetBrains Mono" w:hAnsi="JetBrains Mono" w:eastAsia="JetBrains Mono" w:cs="JetBrains Mono"/>
+                <w:color w:val="0A5A3C"/>
+                <w:sz w:val="15"/>
+                <w:szCs w:val="15"/>
+              </w:rPr>
+              <w:t xml:space="preserve">TELEGRAM_BOT_USERNAME</w:t>
+            </w:r>
+            <w:r>
+              <w:rPr>
+                <w:color w:val="17261F"/>
+                <w:sz w:val="17"/>
+                <w:szCs w:val="17"/>
+              </w:rPr>
+              <w:t xml:space="preserve"> y </w:t>
+            </w:r>
+            <w:r>
+              <w:rPr>
+                <w:rFonts w:ascii="JetBrains Mono" w:hAnsi="JetBrains Mono" w:eastAsia="JetBrains Mono" w:cs="JetBrains Mono"/>
+                <w:color w:val="0A5A3C"/>
+                <w:sz w:val="15"/>
+                <w:szCs w:val="15"/>
+              </w:rPr>
+              <w:t xml:space="preserve">TELEGRAM_WEBHOOK_SECRET</w:t>
+            </w:r>
+            <w:r>
+              <w:rPr>
+                <w:color w:val="17261F"/>
+                <w:sz w:val="17"/>
+                <w:szCs w:val="17"/>
+              </w:rPr>
+              <w:t xml:space="preserve"> a </w:t>
+            </w:r>
+            <w:r>
+              <w:rPr>
+                <w:rFonts w:ascii="JetBrains Mono" w:hAnsi="JetBrains Mono" w:eastAsia="JetBrains Mono" w:cs="JetBrains Mono"/>
+                <w:color w:val="0A5A3C"/>
+                <w:sz w:val="15"/>
+                <w:szCs w:val="15"/>
+              </w:rPr>
+              <w:t xml:space="preserve">ENV_FILE</w:t>
+            </w:r>
+            <w:r>
+              <w:rPr>
+                <w:color w:val="17261F"/>
+                <w:sz w:val="17"/>
+                <w:szCs w:val="17"/>
+              </w:rPr>
+              <w:t xml:space="preserve"> y desplegar</w:t>
+            </w:r>
+          </w:p>
+        </w:tc>
+      </w:tr>
+      <w:tr>
+        <w:trPr>
+          <w:cantSplit/>
+        </w:trPr>
+        <w:tc>
+          <w:tcPr>
+            <w:tcW w:w="2503" w:type="dxa"/>
+            <w:shd w:val="clear" w:color="auto" w:fill="FFFFFF"/>
+            <w:tcMar>
+              <w:top w:w="70" w:type="dxa"/>
+              <w:left w:w="110" w:type="dxa"/>
+              <w:bottom w:w="70" w:type="dxa"/>
+              <w:right w:w="110" w:type="dxa"/>
+            </w:tcMar>
+            <w:vAlign w:val="center"/>
+          </w:tcPr>
+          <w:p>
+            <w:pPr>
+              <w:spacing w:before="0" w:after="0" w:line="252" w:lineRule="auto"/>
+            </w:pPr>
+            <w:r>
+              <w:rPr>
+                <w:b/>
+                <w:bCs/>
+                <w:color w:val="0A5A3C"/>
+                <w:sz w:val="17"/>
+                <w:szCs w:val="17"/>
+              </w:rPr>
               <w:t xml:space="preserve">Actualizar dependencias</w:t>
             </w:r>
           </w:p>
@@ -29102,7 +29323,7 @@
         <w:tc>
           <w:tcPr>
             <w:tcW w:w="6857" w:type="dxa"/>
-            <w:shd w:val="clear" w:color="auto" w:fill="F2F7F4"/>
+            <w:shd w:val="clear" w:color="auto" w:fill="FFFFFF"/>
             <w:tcMar>
               <w:top w:w="70" w:type="dxa"/>
               <w:left w:w="110" w:type="dxa"/>
@@ -29269,6 +29490,7 @@
     </w:p>
     <w:p>
       <w:pPr>
+        <w:keepNext/>
         <w:spacing w:before="60" w:after="0" w:line="240" w:lineRule="auto"/>
         <w:rPr>
           <w:sz w:val="8"/>

</xml_diff>

<commit_message>
Regenerate the technical documentation DOCX and PDF
</commit_message>
<xml_diff>
--- a/docs/SmartPot_Technical_Documentation.docx
+++ b/docs/SmartPot_Technical_Documentation.docx
@@ -1650,7 +1650,7 @@
             <w:sz w:val="18"/>
             <w:szCs w:val="18"/>
           </w:rPr>
-          <w:t xml:space="preserve">9.4 Cultivo en vivo</w:t>
+          <w:t xml:space="preserve">9.4 Ilustración del cultivo</w:t>
         </w:r>
       </w:hyperlink>
     </w:p>
@@ -4357,7 +4357,7 @@
                 <w:sz w:val="17"/>
                 <w:szCs w:val="17"/>
               </w:rPr>
-              <w:t xml:space="preserve">Landing pública, creación de cultivos reales o virtuales, cultivo en vivo ilustrado, asistente, control y alertas; instalable</w:t>
+              <w:t xml:space="preserve">Landing pública, creación de cultivos reales o virtuales, ilustración de cada cultivo, asistente, control y alertas; instalable</w:t>
             </w:r>
           </w:p>
         </w:tc>
@@ -20530,7 +20530,7 @@
           <w:sz w:val="20"/>
           <w:szCs w:val="20"/>
         </w:rPr>
-        <w:t xml:space="preserve">La PWA es lo que ve el usuario: una página pública que explica SmartPot y, tras ingresar, un panel general con todos sus cultivos, el detalle de cada uno con su vista en vivo, un control general, un centro de acciones y lo que ha aprendido el asistente. Se instala como una app en Android, iOS y escritorio.</w:t>
+        <w:t xml:space="preserve">La PWA es lo que ve el usuario: una página pública que explica SmartPot y, tras ingresar, un panel general con todos sus cultivos, el detalle de cada uno con su ilustración, un control general, un centro de acciones y lo que ha aprendido el asistente. Se instala como una app en Android, iOS y escritorio.</w:t>
       </w:r>
     </w:p>
     <w:p>
@@ -21364,7 +21364,7 @@
                 <w:sz w:val="17"/>
                 <w:szCs w:val="17"/>
               </w:rPr>
-              <w:t xml:space="preserve">Detalle · Cultivo en vivo</w:t>
+              <w:t xml:space="preserve">Detalle · Ilustración</w:t>
             </w:r>
           </w:p>
         </w:tc>
@@ -21390,7 +21390,7 @@
                 <w:sz w:val="17"/>
                 <w:szCs w:val="17"/>
               </w:rPr>
-              <w:t xml:space="preserve">Para reales y virtuales: la forma del cultivo (maceta, tubos NFT, torre o balsa) con la especie y el color de su salud, el entorno (interior de día o de noche, o el clima del lugar) y cada actuador animado mientras está encendido, con su botón. Si el cultivo no está conectado no se ilustra. En los virtuales suma los controles de la simulación: modo, lugar, medidores, frecuencia, pausa y reanudación</w:t>
+              <w:t xml:space="preserve">Sobre todas las secciones, para reales y virtuales: la forma del cultivo (maceta, tubos NFT, torre o balsa) con su especie y el color de su salud, el entorno (interior de día o de noche, o el clima del lugar) y el estado de cada actuador, animado mientras está encendido. No tiene botones: las órdenes se dan en Control. Si el cultivo no está conectado no se ilustra</w:t>
             </w:r>
           </w:p>
         </w:tc>
@@ -21423,7 +21423,7 @@
                 <w:sz w:val="17"/>
                 <w:szCs w:val="17"/>
               </w:rPr>
-              <w:t xml:space="preserve">Detalle · Dispositivo</w:t>
+              <w:t xml:space="preserve">Detalle · Simulación</w:t>
             </w:r>
           </w:p>
         </w:tc>
@@ -21449,24 +21449,7 @@
                 <w:sz w:val="17"/>
                 <w:szCs w:val="17"/>
               </w:rPr>
-              <w:t xml:space="preserve">Solo cultivos reales: estado, guía para el ESP32 físico (circuito, firmware y </w:t>
-            </w:r>
-            <w:r>
-              <w:rPr>
-                <w:rFonts w:ascii="JetBrains Mono" w:hAnsi="JetBrains Mono" w:eastAsia="JetBrains Mono" w:cs="JetBrains Mono"/>
-                <w:color w:val="0A5A3C"/>
-                <w:sz w:val="15"/>
-                <w:szCs w:val="15"/>
-              </w:rPr>
-              <w:t xml:space="preserve">config.py</w:t>
-            </w:r>
-            <w:r>
-              <w:rPr>
-                <w:color w:val="17261F"/>
-                <w:sz w:val="17"/>
-                <w:szCs w:val="17"/>
-              </w:rPr>
-              <w:t xml:space="preserve">) o para Wokwi, datos de conexión MQTT y rotación de la clave</w:t>
+              <w:t xml:space="preserve">Solo cultivos virtuales: modo, lugar, medidores, frecuencia, pausa y reanudación</w:t>
             </w:r>
           </w:p>
         </w:tc>
@@ -21499,7 +21482,7 @@
                 <w:sz w:val="17"/>
                 <w:szCs w:val="17"/>
               </w:rPr>
-              <w:t xml:space="preserve">Detalle · Ajustes</w:t>
+              <w:t xml:space="preserve">Detalle · Dispositivo</w:t>
             </w:r>
           </w:p>
         </w:tc>
@@ -21525,7 +21508,24 @@
                 <w:sz w:val="17"/>
                 <w:szCs w:val="17"/>
               </w:rPr>
-              <w:t xml:space="preserve">Nombre, especie y forma; el tipo real o virtual se muestra y no se puede cambiar</w:t>
+              <w:t xml:space="preserve">Solo cultivos reales: estado, guía para el ESP32 físico (circuito, firmware y </w:t>
+            </w:r>
+            <w:r>
+              <w:rPr>
+                <w:rFonts w:ascii="JetBrains Mono" w:hAnsi="JetBrains Mono" w:eastAsia="JetBrains Mono" w:cs="JetBrains Mono"/>
+                <w:color w:val="0A5A3C"/>
+                <w:sz w:val="15"/>
+                <w:szCs w:val="15"/>
+              </w:rPr>
+              <w:t xml:space="preserve">config.py</w:t>
+            </w:r>
+            <w:r>
+              <w:rPr>
+                <w:color w:val="17261F"/>
+                <w:sz w:val="17"/>
+                <w:szCs w:val="17"/>
+              </w:rPr>
+              <w:t xml:space="preserve">) o para Wokwi, datos de conexión MQTT y rotación de la clave</w:t>
             </w:r>
           </w:p>
         </w:tc>
@@ -21558,6 +21558,65 @@
                 <w:sz w:val="17"/>
                 <w:szCs w:val="17"/>
               </w:rPr>
+              <w:t xml:space="preserve">Detalle · Ajustes</w:t>
+            </w:r>
+          </w:p>
+        </w:tc>
+        <w:tc>
+          <w:tcPr>
+            <w:tcW w:w="6788" w:type="dxa"/>
+            <w:shd w:val="clear" w:color="auto" w:fill="F2F7F4"/>
+            <w:tcMar>
+              <w:top w:w="70" w:type="dxa"/>
+              <w:left w:w="110" w:type="dxa"/>
+              <w:bottom w:w="70" w:type="dxa"/>
+              <w:right w:w="110" w:type="dxa"/>
+            </w:tcMar>
+            <w:vAlign w:val="center"/>
+          </w:tcPr>
+          <w:p>
+            <w:pPr>
+              <w:spacing w:before="0" w:after="0" w:line="252" w:lineRule="auto"/>
+            </w:pPr>
+            <w:r>
+              <w:rPr>
+                <w:color w:val="17261F"/>
+                <w:sz w:val="17"/>
+                <w:szCs w:val="17"/>
+              </w:rPr>
+              <w:t xml:space="preserve">Nombre, especie y forma; el tipo real o virtual se muestra y no se puede cambiar</w:t>
+            </w:r>
+          </w:p>
+        </w:tc>
+      </w:tr>
+      <w:tr>
+        <w:trPr>
+          <w:cantSplit/>
+        </w:trPr>
+        <w:tc>
+          <w:tcPr>
+            <w:tcW w:w="2572" w:type="dxa"/>
+            <w:shd w:val="clear" w:color="auto" w:fill="FFFFFF"/>
+            <w:tcMar>
+              <w:top w:w="70" w:type="dxa"/>
+              <w:left w:w="110" w:type="dxa"/>
+              <w:bottom w:w="70" w:type="dxa"/>
+              <w:right w:w="110" w:type="dxa"/>
+            </w:tcMar>
+            <w:vAlign w:val="center"/>
+          </w:tcPr>
+          <w:p>
+            <w:pPr>
+              <w:spacing w:before="0" w:after="0" w:line="252" w:lineRule="auto"/>
+            </w:pPr>
+            <w:r>
+              <w:rPr>
+                <w:b/>
+                <w:bCs/>
+                <w:color w:val="0A5A3C"/>
+                <w:sz w:val="17"/>
+                <w:szCs w:val="17"/>
+              </w:rPr>
               <w:t xml:space="preserve">Alertas y perfil</w:t>
             </w:r>
           </w:p>
@@ -21565,7 +21624,7 @@
         <w:tc>
           <w:tcPr>
             <w:tcW w:w="6788" w:type="dxa"/>
-            <w:shd w:val="clear" w:color="auto" w:fill="F2F7F4"/>
+            <w:shd w:val="clear" w:color="auto" w:fill="FFFFFF"/>
             <w:tcMar>
               <w:top w:w="70" w:type="dxa"/>
               <w:left w:w="110" w:type="dxa"/>
@@ -25177,7 +25236,7 @@
           <w:sz w:val="25"/>
           <w:szCs w:val="25"/>
         </w:rPr>
-        <w:t xml:space="preserve">9.4 Cultivo en vivo</w:t>
+        <w:t xml:space="preserve">9.4 Ilustración del cultivo</w:t>
       </w:r>
       <w:bookmarkEnd w:id="153"/>
     </w:p>
@@ -25191,25 +25250,7 @@
           <w:sz w:val="20"/>
           <w:szCs w:val="20"/>
         </w:rPr>
-        <w:t xml:space="preserve">La pestaña </w:t>
-      </w:r>
-      <w:r>
-        <w:rPr>
-          <w:b/>
-          <w:bCs/>
-          <w:color w:val="17261F"/>
-          <w:sz w:val="20"/>
-          <w:szCs w:val="20"/>
-        </w:rPr>
-        <w:t xml:space="preserve">Cultivo en vivo</w:t>
-      </w:r>
-      <w:r>
-        <w:rPr>
-          <w:color w:val="17261F"/>
-          <w:sz w:val="20"/>
-          <w:szCs w:val="20"/>
-        </w:rPr>
-        <w:t xml:space="preserve"> dibuja cada cultivo, real o virtual, como es:</w:t>
+        <w:t xml:space="preserve">Encima de todas las secciones del detalle, la PWA dibuja cada cultivo, real o virtual, como es:</w:t>
       </w:r>
     </w:p>
     <w:p>
@@ -25420,7 +25461,7 @@
                 <w:sz w:val="17"/>
                 <w:szCs w:val="17"/>
               </w:rPr>
-              <w:t xml:space="preserve">La especie (lechuga, espinaca, albahaca, tomate, fresa o pimentón) con el color de su índice de salud</w:t>
+              <w:t xml:space="preserve">La especie tal como es: lechuga en roseta, espinaca de hoja ancha, albahaca de hojas pareadas, tomate con tutor, flores y frutos rojos, fresa con flor blanca y frutos, pimentón rojo y amarillo; el color de las hojas sigue su índice de salud</w:t>
             </w:r>
           </w:p>
         </w:tc>
@@ -25538,7 +25579,7 @@
                 <w:sz w:val="17"/>
                 <w:szCs w:val="17"/>
               </w:rPr>
-              <w:t xml:space="preserve">Solo los instalados: la bomba hace correr la solución (o burbujas en la balsa), la luz ilumina, el ventilador gira, el humidificador suelta bruma y los dosificadores gotean; cada uno con su estado y su botón</w:t>
+              <w:t xml:space="preserve">Solo los instalados: la bomba hace correr la solución (o burbujas en la balsa), la luz ilumina, el ventilador gira, el humidificador suelta bruma y los dosificadores gotean; cada uno con su estado, sin botones</w:t>
             </w:r>
           </w:p>
         </w:tc>
@@ -29512,7 +29553,7 @@
                 <w:sz w:val="17"/>
                 <w:szCs w:val="17"/>
               </w:rPr>
-              <w:t xml:space="preserve">52</w:t>
+              <w:t xml:space="preserve">54</w:t>
             </w:r>
           </w:p>
         </w:tc>
@@ -29538,7 +29579,7 @@
                 <w:sz w:val="17"/>
                 <w:szCs w:val="17"/>
               </w:rPr>
-              <w:t xml:space="preserve">Cliente HTTP, sesión, validaciones, ingreso, componentes del cultivo, asistente con pronóstico y lo aprendido, comparación de modelos, canales de Telegram, cultivo en vivo (formas, actuadores, clima y conexión), creación real o virtual, guía de conexión, panel general y requisitos de SEO y PWA</w:t>
+              <w:t xml:space="preserve">Cliente HTTP, sesión, validaciones, ingreso, componentes del cultivo, asistente con pronóstico y lo aprendido, comparación de modelos, canales de Telegram, ilustración del cultivo (formas, especies, actuadores, clima y conexión), creación real o virtual, guía de conexión, panel general y requisitos de SEO y PWA</w:t>
             </w:r>
           </w:p>
         </w:tc>
@@ -31235,8 +31276,8 @@
         <w:tblLook w:val="04A0" w:firstRow="1" w:firstColumn="1" w:noVBand="1"/>
       </w:tblPr>
       <w:tblGrid>
-        <w:gridCol w:w="2502"/>
-        <w:gridCol w:w="6858"/>
+        <w:gridCol w:w="2501"/>
+        <w:gridCol w:w="6859"/>
       </w:tblGrid>
       <w:tr>
         <w:trPr>
@@ -31245,7 +31286,7 @@
         </w:trPr>
         <w:tc>
           <w:tcPr>
-            <w:tcW w:w="2502" w:type="dxa"/>
+            <w:tcW w:w="2501" w:type="dxa"/>
             <w:shd w:val="clear" w:color="auto" w:fill="0B3D2B"/>
             <w:tcMar>
               <w:top w:w="70" w:type="dxa"/>
@@ -31274,7 +31315,7 @@
         </w:tc>
         <w:tc>
           <w:tcPr>
-            <w:tcW w:w="6858" w:type="dxa"/>
+            <w:tcW w:w="6859" w:type="dxa"/>
             <w:shd w:val="clear" w:color="auto" w:fill="0B3D2B"/>
             <w:tcMar>
               <w:top w:w="70" w:type="dxa"/>
@@ -31308,7 +31349,7 @@
         </w:trPr>
         <w:tc>
           <w:tcPr>
-            <w:tcW w:w="2502" w:type="dxa"/>
+            <w:tcW w:w="2501" w:type="dxa"/>
             <w:shd w:val="clear" w:color="auto" w:fill="FFFFFF"/>
             <w:tcMar>
               <w:top w:w="70" w:type="dxa"/>
@@ -31336,7 +31377,7 @@
         </w:tc>
         <w:tc>
           <w:tcPr>
-            <w:tcW w:w="6858" w:type="dxa"/>
+            <w:tcW w:w="6859" w:type="dxa"/>
             <w:shd w:val="clear" w:color="auto" w:fill="FFFFFF"/>
             <w:tcMar>
               <w:top w:w="70" w:type="dxa"/>
@@ -31367,7 +31408,7 @@
         </w:trPr>
         <w:tc>
           <w:tcPr>
-            <w:tcW w:w="2502" w:type="dxa"/>
+            <w:tcW w:w="2501" w:type="dxa"/>
             <w:shd w:val="clear" w:color="auto" w:fill="F2F7F4"/>
             <w:tcMar>
               <w:top w:w="70" w:type="dxa"/>
@@ -31395,7 +31436,7 @@
         </w:tc>
         <w:tc>
           <w:tcPr>
-            <w:tcW w:w="6858" w:type="dxa"/>
+            <w:tcW w:w="6859" w:type="dxa"/>
             <w:shd w:val="clear" w:color="auto" w:fill="F2F7F4"/>
             <w:tcMar>
               <w:top w:w="70" w:type="dxa"/>
@@ -31426,7 +31467,7 @@
         </w:trPr>
         <w:tc>
           <w:tcPr>
-            <w:tcW w:w="2502" w:type="dxa"/>
+            <w:tcW w:w="2501" w:type="dxa"/>
             <w:shd w:val="clear" w:color="auto" w:fill="FFFFFF"/>
             <w:tcMar>
               <w:top w:w="70" w:type="dxa"/>
@@ -31454,7 +31495,7 @@
         </w:tc>
         <w:tc>
           <w:tcPr>
-            <w:tcW w:w="6858" w:type="dxa"/>
+            <w:tcW w:w="6859" w:type="dxa"/>
             <w:shd w:val="clear" w:color="auto" w:fill="FFFFFF"/>
             <w:tcMar>
               <w:top w:w="70" w:type="dxa"/>
@@ -31485,7 +31526,7 @@
         </w:trPr>
         <w:tc>
           <w:tcPr>
-            <w:tcW w:w="2502" w:type="dxa"/>
+            <w:tcW w:w="2501" w:type="dxa"/>
             <w:shd w:val="clear" w:color="auto" w:fill="F2F7F4"/>
             <w:tcMar>
               <w:top w:w="70" w:type="dxa"/>
@@ -31513,7 +31554,7 @@
         </w:tc>
         <w:tc>
           <w:tcPr>
-            <w:tcW w:w="6858" w:type="dxa"/>
+            <w:tcW w:w="6859" w:type="dxa"/>
             <w:shd w:val="clear" w:color="auto" w:fill="F2F7F4"/>
             <w:tcMar>
               <w:top w:w="70" w:type="dxa"/>
@@ -31544,7 +31585,7 @@
         </w:trPr>
         <w:tc>
           <w:tcPr>
-            <w:tcW w:w="2502" w:type="dxa"/>
+            <w:tcW w:w="2501" w:type="dxa"/>
             <w:shd w:val="clear" w:color="auto" w:fill="FFFFFF"/>
             <w:tcMar>
               <w:top w:w="70" w:type="dxa"/>
@@ -31572,7 +31613,7 @@
         </w:tc>
         <w:tc>
           <w:tcPr>
-            <w:tcW w:w="6858" w:type="dxa"/>
+            <w:tcW w:w="6859" w:type="dxa"/>
             <w:shd w:val="clear" w:color="auto" w:fill="FFFFFF"/>
             <w:tcMar>
               <w:top w:w="70" w:type="dxa"/>
@@ -31603,7 +31644,7 @@
         </w:trPr>
         <w:tc>
           <w:tcPr>
-            <w:tcW w:w="2502" w:type="dxa"/>
+            <w:tcW w:w="2501" w:type="dxa"/>
             <w:shd w:val="clear" w:color="auto" w:fill="F2F7F4"/>
             <w:tcMar>
               <w:top w:w="70" w:type="dxa"/>
@@ -31631,7 +31672,7 @@
         </w:tc>
         <w:tc>
           <w:tcPr>
-            <w:tcW w:w="6858" w:type="dxa"/>
+            <w:tcW w:w="6859" w:type="dxa"/>
             <w:shd w:val="clear" w:color="auto" w:fill="F2F7F4"/>
             <w:tcMar>
               <w:top w:w="70" w:type="dxa"/>
@@ -31662,55 +31703,55 @@
         </w:trPr>
         <w:tc>
           <w:tcPr>
-            <w:tcW w:w="2502" w:type="dxa"/>
-            <w:shd w:val="clear" w:color="auto" w:fill="FFFFFF"/>
-            <w:tcMar>
-              <w:top w:w="70" w:type="dxa"/>
-              <w:left w:w="110" w:type="dxa"/>
-              <w:bottom w:w="70" w:type="dxa"/>
-              <w:right w:w="110" w:type="dxa"/>
-            </w:tcMar>
-            <w:vAlign w:val="center"/>
-          </w:tcPr>
-          <w:p>
-            <w:pPr>
-              <w:spacing w:before="0" w:after="0" w:line="252" w:lineRule="auto"/>
-            </w:pPr>
-            <w:r>
-              <w:rPr>
-                <w:b/>
-                <w:bCs/>
-                <w:color w:val="0A5A3C"/>
-                <w:sz w:val="17"/>
-                <w:szCs w:val="17"/>
-              </w:rPr>
-              <w:t xml:space="preserve">Cultivo en vivo</w:t>
-            </w:r>
-          </w:p>
-        </w:tc>
-        <w:tc>
-          <w:tcPr>
-            <w:tcW w:w="6858" w:type="dxa"/>
-            <w:shd w:val="clear" w:color="auto" w:fill="FFFFFF"/>
-            <w:tcMar>
-              <w:top w:w="70" w:type="dxa"/>
-              <w:left w:w="110" w:type="dxa"/>
-              <w:bottom w:w="70" w:type="dxa"/>
-              <w:right w:w="110" w:type="dxa"/>
-            </w:tcMar>
-            <w:vAlign w:val="center"/>
-          </w:tcPr>
-          <w:p>
-            <w:pPr>
-              <w:spacing w:before="0" w:after="0" w:line="252" w:lineRule="auto"/>
-            </w:pPr>
-            <w:r>
-              <w:rPr>
-                <w:color w:val="17261F"/>
-                <w:sz w:val="17"/>
-                <w:szCs w:val="17"/>
-              </w:rPr>
-              <w:t xml:space="preserve">Ilustración del cultivo con su forma, su planta y cada actuador encendido o apagado</w:t>
+            <w:tcW w:w="2501" w:type="dxa"/>
+            <w:shd w:val="clear" w:color="auto" w:fill="FFFFFF"/>
+            <w:tcMar>
+              <w:top w:w="70" w:type="dxa"/>
+              <w:left w:w="110" w:type="dxa"/>
+              <w:bottom w:w="70" w:type="dxa"/>
+              <w:right w:w="110" w:type="dxa"/>
+            </w:tcMar>
+            <w:vAlign w:val="center"/>
+          </w:tcPr>
+          <w:p>
+            <w:pPr>
+              <w:spacing w:before="0" w:after="0" w:line="252" w:lineRule="auto"/>
+            </w:pPr>
+            <w:r>
+              <w:rPr>
+                <w:b/>
+                <w:bCs/>
+                <w:color w:val="0A5A3C"/>
+                <w:sz w:val="17"/>
+                <w:szCs w:val="17"/>
+              </w:rPr>
+              <w:t xml:space="preserve">Ilustración del cultivo</w:t>
+            </w:r>
+          </w:p>
+        </w:tc>
+        <w:tc>
+          <w:tcPr>
+            <w:tcW w:w="6859" w:type="dxa"/>
+            <w:shd w:val="clear" w:color="auto" w:fill="FFFFFF"/>
+            <w:tcMar>
+              <w:top w:w="70" w:type="dxa"/>
+              <w:left w:w="110" w:type="dxa"/>
+              <w:bottom w:w="70" w:type="dxa"/>
+              <w:right w:w="110" w:type="dxa"/>
+            </w:tcMar>
+            <w:vAlign w:val="center"/>
+          </w:tcPr>
+          <w:p>
+            <w:pPr>
+              <w:spacing w:before="0" w:after="0" w:line="252" w:lineRule="auto"/>
+            </w:pPr>
+            <w:r>
+              <w:rPr>
+                <w:color w:val="17261F"/>
+                <w:sz w:val="17"/>
+                <w:szCs w:val="17"/>
+              </w:rPr>
+              <w:t xml:space="preserve">Dibujo sobre todas las secciones del detalle con su forma, su especie y cada actuador encendido o apagado</w:t>
             </w:r>
           </w:p>
         </w:tc>
@@ -31721,7 +31762,7 @@
         </w:trPr>
         <w:tc>
           <w:tcPr>
-            <w:tcW w:w="2502" w:type="dxa"/>
+            <w:tcW w:w="2501" w:type="dxa"/>
             <w:shd w:val="clear" w:color="auto" w:fill="F2F7F4"/>
             <w:tcMar>
               <w:top w:w="70" w:type="dxa"/>
@@ -31749,7 +31790,7 @@
         </w:tc>
         <w:tc>
           <w:tcPr>
-            <w:tcW w:w="6858" w:type="dxa"/>
+            <w:tcW w:w="6859" w:type="dxa"/>
             <w:shd w:val="clear" w:color="auto" w:fill="F2F7F4"/>
             <w:tcMar>
               <w:top w:w="70" w:type="dxa"/>
@@ -31780,7 +31821,7 @@
         </w:trPr>
         <w:tc>
           <w:tcPr>
-            <w:tcW w:w="2502" w:type="dxa"/>
+            <w:tcW w:w="2501" w:type="dxa"/>
             <w:shd w:val="clear" w:color="auto" w:fill="FFFFFF"/>
             <w:tcMar>
               <w:top w:w="70" w:type="dxa"/>
@@ -31808,7 +31849,7 @@
         </w:tc>
         <w:tc>
           <w:tcPr>
-            <w:tcW w:w="6858" w:type="dxa"/>
+            <w:tcW w:w="6859" w:type="dxa"/>
             <w:shd w:val="clear" w:color="auto" w:fill="FFFFFF"/>
             <w:tcMar>
               <w:top w:w="70" w:type="dxa"/>
@@ -31839,7 +31880,7 @@
         </w:trPr>
         <w:tc>
           <w:tcPr>
-            <w:tcW w:w="2502" w:type="dxa"/>
+            <w:tcW w:w="2501" w:type="dxa"/>
             <w:shd w:val="clear" w:color="auto" w:fill="F2F7F4"/>
             <w:tcMar>
               <w:top w:w="70" w:type="dxa"/>
@@ -31867,7 +31908,7 @@
         </w:tc>
         <w:tc>
           <w:tcPr>
-            <w:tcW w:w="6858" w:type="dxa"/>
+            <w:tcW w:w="6859" w:type="dxa"/>
             <w:shd w:val="clear" w:color="auto" w:fill="F2F7F4"/>
             <w:tcMar>
               <w:top w:w="70" w:type="dxa"/>
@@ -31898,7 +31939,7 @@
         </w:trPr>
         <w:tc>
           <w:tcPr>
-            <w:tcW w:w="2502" w:type="dxa"/>
+            <w:tcW w:w="2501" w:type="dxa"/>
             <w:shd w:val="clear" w:color="auto" w:fill="FFFFFF"/>
             <w:tcMar>
               <w:top w:w="70" w:type="dxa"/>
@@ -31926,7 +31967,7 @@
         </w:tc>
         <w:tc>
           <w:tcPr>
-            <w:tcW w:w="6858" w:type="dxa"/>
+            <w:tcW w:w="6859" w:type="dxa"/>
             <w:shd w:val="clear" w:color="auto" w:fill="FFFFFF"/>
             <w:tcMar>
               <w:top w:w="70" w:type="dxa"/>
@@ -31957,7 +31998,7 @@
         </w:trPr>
         <w:tc>
           <w:tcPr>
-            <w:tcW w:w="2502" w:type="dxa"/>
+            <w:tcW w:w="2501" w:type="dxa"/>
             <w:shd w:val="clear" w:color="auto" w:fill="F2F7F4"/>
             <w:tcMar>
               <w:top w:w="70" w:type="dxa"/>
@@ -31985,7 +32026,7 @@
         </w:tc>
         <w:tc>
           <w:tcPr>
-            <w:tcW w:w="6858" w:type="dxa"/>
+            <w:tcW w:w="6859" w:type="dxa"/>
             <w:shd w:val="clear" w:color="auto" w:fill="F2F7F4"/>
             <w:tcMar>
               <w:top w:w="70" w:type="dxa"/>
@@ -32016,7 +32057,7 @@
         </w:trPr>
         <w:tc>
           <w:tcPr>
-            <w:tcW w:w="2502" w:type="dxa"/>
+            <w:tcW w:w="2501" w:type="dxa"/>
             <w:shd w:val="clear" w:color="auto" w:fill="FFFFFF"/>
             <w:tcMar>
               <w:top w:w="70" w:type="dxa"/>
@@ -32044,7 +32085,7 @@
         </w:tc>
         <w:tc>
           <w:tcPr>
-            <w:tcW w:w="6858" w:type="dxa"/>
+            <w:tcW w:w="6859" w:type="dxa"/>
             <w:shd w:val="clear" w:color="auto" w:fill="FFFFFF"/>
             <w:tcMar>
               <w:top w:w="70" w:type="dxa"/>
@@ -32075,7 +32116,7 @@
         </w:trPr>
         <w:tc>
           <w:tcPr>
-            <w:tcW w:w="2502" w:type="dxa"/>
+            <w:tcW w:w="2501" w:type="dxa"/>
             <w:shd w:val="clear" w:color="auto" w:fill="F2F7F4"/>
             <w:tcMar>
               <w:top w:w="70" w:type="dxa"/>
@@ -32103,7 +32144,7 @@
         </w:tc>
         <w:tc>
           <w:tcPr>
-            <w:tcW w:w="6858" w:type="dxa"/>
+            <w:tcW w:w="6859" w:type="dxa"/>
             <w:shd w:val="clear" w:color="auto" w:fill="F2F7F4"/>
             <w:tcMar>
               <w:top w:w="70" w:type="dxa"/>
@@ -32134,7 +32175,7 @@
         </w:trPr>
         <w:tc>
           <w:tcPr>
-            <w:tcW w:w="2502" w:type="dxa"/>
+            <w:tcW w:w="2501" w:type="dxa"/>
             <w:shd w:val="clear" w:color="auto" w:fill="FFFFFF"/>
             <w:tcMar>
               <w:top w:w="70" w:type="dxa"/>
@@ -32162,7 +32203,7 @@
         </w:tc>
         <w:tc>
           <w:tcPr>
-            <w:tcW w:w="6858" w:type="dxa"/>
+            <w:tcW w:w="6859" w:type="dxa"/>
             <w:shd w:val="clear" w:color="auto" w:fill="FFFFFF"/>
             <w:tcMar>
               <w:top w:w="70" w:type="dxa"/>
@@ -32193,7 +32234,7 @@
         </w:trPr>
         <w:tc>
           <w:tcPr>
-            <w:tcW w:w="2502" w:type="dxa"/>
+            <w:tcW w:w="2501" w:type="dxa"/>
             <w:shd w:val="clear" w:color="auto" w:fill="F2F7F4"/>
             <w:tcMar>
               <w:top w:w="70" w:type="dxa"/>
@@ -32221,7 +32262,7 @@
         </w:tc>
         <w:tc>
           <w:tcPr>
-            <w:tcW w:w="6858" w:type="dxa"/>
+            <w:tcW w:w="6859" w:type="dxa"/>
             <w:shd w:val="clear" w:color="auto" w:fill="F2F7F4"/>
             <w:tcMar>
               <w:top w:w="70" w:type="dxa"/>
@@ -32252,7 +32293,7 @@
         </w:trPr>
         <w:tc>
           <w:tcPr>
-            <w:tcW w:w="2502" w:type="dxa"/>
+            <w:tcW w:w="2501" w:type="dxa"/>
             <w:shd w:val="clear" w:color="auto" w:fill="FFFFFF"/>
             <w:tcMar>
               <w:top w:w="70" w:type="dxa"/>
@@ -32280,7 +32321,7 @@
         </w:tc>
         <w:tc>
           <w:tcPr>
-            <w:tcW w:w="6858" w:type="dxa"/>
+            <w:tcW w:w="6859" w:type="dxa"/>
             <w:shd w:val="clear" w:color="auto" w:fill="FFFFFF"/>
             <w:tcMar>
               <w:top w:w="70" w:type="dxa"/>
@@ -32311,7 +32352,7 @@
         </w:trPr>
         <w:tc>
           <w:tcPr>
-            <w:tcW w:w="2502" w:type="dxa"/>
+            <w:tcW w:w="2501" w:type="dxa"/>
             <w:shd w:val="clear" w:color="auto" w:fill="F2F7F4"/>
             <w:tcMar>
               <w:top w:w="70" w:type="dxa"/>
@@ -32339,7 +32380,7 @@
         </w:tc>
         <w:tc>
           <w:tcPr>
-            <w:tcW w:w="6858" w:type="dxa"/>
+            <w:tcW w:w="6859" w:type="dxa"/>
             <w:shd w:val="clear" w:color="auto" w:fill="F2F7F4"/>
             <w:tcMar>
               <w:top w:w="70" w:type="dxa"/>
@@ -32370,7 +32411,7 @@
         </w:trPr>
         <w:tc>
           <w:tcPr>
-            <w:tcW w:w="2502" w:type="dxa"/>
+            <w:tcW w:w="2501" w:type="dxa"/>
             <w:shd w:val="clear" w:color="auto" w:fill="FFFFFF"/>
             <w:tcMar>
               <w:top w:w="70" w:type="dxa"/>
@@ -32398,7 +32439,7 @@
         </w:tc>
         <w:tc>
           <w:tcPr>
-            <w:tcW w:w="6858" w:type="dxa"/>
+            <w:tcW w:w="6859" w:type="dxa"/>
             <w:shd w:val="clear" w:color="auto" w:fill="FFFFFF"/>
             <w:tcMar>
               <w:top w:w="70" w:type="dxa"/>
@@ -32429,7 +32470,7 @@
         </w:trPr>
         <w:tc>
           <w:tcPr>
-            <w:tcW w:w="2502" w:type="dxa"/>
+            <w:tcW w:w="2501" w:type="dxa"/>
             <w:shd w:val="clear" w:color="auto" w:fill="F2F7F4"/>
             <w:tcMar>
               <w:top w:w="70" w:type="dxa"/>
@@ -32457,7 +32498,7 @@
         </w:tc>
         <w:tc>
           <w:tcPr>
-            <w:tcW w:w="6858" w:type="dxa"/>
+            <w:tcW w:w="6859" w:type="dxa"/>
             <w:shd w:val="clear" w:color="auto" w:fill="F2F7F4"/>
             <w:tcMar>
               <w:top w:w="70" w:type="dxa"/>
@@ -32488,7 +32529,7 @@
         </w:trPr>
         <w:tc>
           <w:tcPr>
-            <w:tcW w:w="2502" w:type="dxa"/>
+            <w:tcW w:w="2501" w:type="dxa"/>
             <w:shd w:val="clear" w:color="auto" w:fill="FFFFFF"/>
             <w:tcMar>
               <w:top w:w="70" w:type="dxa"/>
@@ -32516,7 +32557,7 @@
         </w:tc>
         <w:tc>
           <w:tcPr>
-            <w:tcW w:w="6858" w:type="dxa"/>
+            <w:tcW w:w="6859" w:type="dxa"/>
             <w:shd w:val="clear" w:color="auto" w:fill="FFFFFF"/>
             <w:tcMar>
               <w:top w:w="70" w:type="dxa"/>
@@ -32547,7 +32588,7 @@
         </w:trPr>
         <w:tc>
           <w:tcPr>
-            <w:tcW w:w="2502" w:type="dxa"/>
+            <w:tcW w:w="2501" w:type="dxa"/>
             <w:shd w:val="clear" w:color="auto" w:fill="F2F7F4"/>
             <w:tcMar>
               <w:top w:w="70" w:type="dxa"/>
@@ -32575,7 +32616,7 @@
         </w:tc>
         <w:tc>
           <w:tcPr>
-            <w:tcW w:w="6858" w:type="dxa"/>
+            <w:tcW w:w="6859" w:type="dxa"/>
             <w:shd w:val="clear" w:color="auto" w:fill="F2F7F4"/>
             <w:tcMar>
               <w:top w:w="70" w:type="dxa"/>
@@ -32606,7 +32647,7 @@
         </w:trPr>
         <w:tc>
           <w:tcPr>
-            <w:tcW w:w="2502" w:type="dxa"/>
+            <w:tcW w:w="2501" w:type="dxa"/>
             <w:shd w:val="clear" w:color="auto" w:fill="FFFFFF"/>
             <w:tcMar>
               <w:top w:w="70" w:type="dxa"/>
@@ -32634,7 +32675,7 @@
         </w:tc>
         <w:tc>
           <w:tcPr>
-            <w:tcW w:w="6858" w:type="dxa"/>
+            <w:tcW w:w="6859" w:type="dxa"/>
             <w:shd w:val="clear" w:color="auto" w:fill="FFFFFF"/>
             <w:tcMar>
               <w:top w:w="70" w:type="dxa"/>
@@ -32665,7 +32706,7 @@
         </w:trPr>
         <w:tc>
           <w:tcPr>
-            <w:tcW w:w="2502" w:type="dxa"/>
+            <w:tcW w:w="2501" w:type="dxa"/>
             <w:shd w:val="clear" w:color="auto" w:fill="F2F7F4"/>
             <w:tcMar>
               <w:top w:w="70" w:type="dxa"/>
@@ -32693,7 +32734,7 @@
         </w:tc>
         <w:tc>
           <w:tcPr>
-            <w:tcW w:w="6858" w:type="dxa"/>
+            <w:tcW w:w="6859" w:type="dxa"/>
             <w:shd w:val="clear" w:color="auto" w:fill="F2F7F4"/>
             <w:tcMar>
               <w:top w:w="70" w:type="dxa"/>
@@ -32724,7 +32765,7 @@
         </w:trPr>
         <w:tc>
           <w:tcPr>
-            <w:tcW w:w="2502" w:type="dxa"/>
+            <w:tcW w:w="2501" w:type="dxa"/>
             <w:shd w:val="clear" w:color="auto" w:fill="FFFFFF"/>
             <w:tcMar>
               <w:top w:w="70" w:type="dxa"/>
@@ -32752,7 +32793,7 @@
         </w:tc>
         <w:tc>
           <w:tcPr>
-            <w:tcW w:w="6858" w:type="dxa"/>
+            <w:tcW w:w="6859" w:type="dxa"/>
             <w:shd w:val="clear" w:color="auto" w:fill="FFFFFF"/>
             <w:tcMar>
               <w:top w:w="70" w:type="dxa"/>
@@ -32783,7 +32824,7 @@
         </w:trPr>
         <w:tc>
           <w:tcPr>
-            <w:tcW w:w="2502" w:type="dxa"/>
+            <w:tcW w:w="2501" w:type="dxa"/>
             <w:shd w:val="clear" w:color="auto" w:fill="F2F7F4"/>
             <w:tcMar>
               <w:top w:w="70" w:type="dxa"/>
@@ -32811,7 +32852,7 @@
         </w:tc>
         <w:tc>
           <w:tcPr>
-            <w:tcW w:w="6858" w:type="dxa"/>
+            <w:tcW w:w="6859" w:type="dxa"/>
             <w:shd w:val="clear" w:color="auto" w:fill="F2F7F4"/>
             <w:tcMar>
               <w:top w:w="70" w:type="dxa"/>
@@ -32842,7 +32883,7 @@
         </w:trPr>
         <w:tc>
           <w:tcPr>
-            <w:tcW w:w="2502" w:type="dxa"/>
+            <w:tcW w:w="2501" w:type="dxa"/>
             <w:shd w:val="clear" w:color="auto" w:fill="FFFFFF"/>
             <w:tcMar>
               <w:top w:w="70" w:type="dxa"/>
@@ -32870,7 +32911,7 @@
         </w:tc>
         <w:tc>
           <w:tcPr>
-            <w:tcW w:w="6858" w:type="dxa"/>
+            <w:tcW w:w="6859" w:type="dxa"/>
             <w:shd w:val="clear" w:color="auto" w:fill="FFFFFF"/>
             <w:tcMar>
               <w:top w:w="70" w:type="dxa"/>

</xml_diff>